<commit_message>
Lab 7: reframe SOF as systematic fund, add learning-outcome paragraph
Co-Authored-By: Claude Sonnet 5.5 <noreply@anthropic.com>
Claude-Session: https://claude.ai/code/session_014BZUFgw412ncvBmxUhFPPy
</commit_message>
<xml_diff>
--- a/lab7-web-app/Lab7_Kouzmanoff_Report.docx
+++ b/lab7-web-app/Lab7_Kouzmanoff_Report.docx
@@ -31,7 +31,7 @@
         <w:t xml:space="preserve">Organization or business area: </w:t>
       </w:r>
       <w:r>
-        <w:t>Scholars Opportunity Fund (SOF), a student-run event-driven investment fund at the University of Utah. Sample content in the webpage is illustrative and does not describe official fund policy.</w:t>
+        <w:t>Scholars Opportunity Fund (SOF), a student-run systematic hedge fund at the University of Utah that finds most of its catalysts through event-driven work and runs a range of strategies, including quantitative and machine-learning signals and text-based filing strategies. Sample content in the webpage is illustrative and does not describe official fund policy.</w:t>
       </w:r>
     </w:p>
     <w:p>
@@ -42,7 +42,7 @@
         <w:t xml:space="preserve">Process: </w:t>
       </w:r>
       <w:r>
-        <w:t>Research request intake and triage: an analyst asks a pod lead for research on an event-driven situation such as a merger, spin-off, or tender offer, and the fund produces a research memo.</w:t>
+        <w:t>Research request intake and triage: an analyst asks a pod lead for research support on a catalyst or signal idea, such as an earnings-guidance screen, a filing-based text signal, or a corporate-action event study, and the fund returns a memo, dataset, or backtest result.</w:t>
       </w:r>
     </w:p>
     <w:p>
@@ -53,7 +53,7 @@
         <w:t xml:space="preserve">Users: </w:t>
       </w:r>
       <w:r>
-        <w:t>Analysts who request research, pod leads who assign and review it, portfolio managers who use the memo, and the faculty advisor.</w:t>
+        <w:t>Analysts who request research, pod leads who assign and review it, portfolio managers who decide which signals to run, and the faculty advisor.</w:t>
       </w:r>
     </w:p>
     <w:p>
@@ -64,7 +64,7 @@
         <w:t xml:space="preserve">Current problem: </w:t>
       </w:r>
       <w:r>
-        <w:t>Requests arrive by message with missing details, status is hard to see, and two analysts can research the same company without knowing it.</w:t>
+        <w:t>Requests arrive by message with missing details, status is hard to see, and two analysts can work on the same name or signal without knowing it.</w:t>
       </w:r>
     </w:p>
     <w:p>
@@ -340,7 +340,7 @@
       <w:r>
         <w:drawing>
           <wp:inline xmlns:a="http://schemas.openxmlformats.org/drawingml/2006/main" xmlns:pic="http://schemas.openxmlformats.org/drawingml/2006/picture">
-            <wp:extent cx="5669280" cy="3246511"/>
+            <wp:extent cx="5669280" cy="3682609"/>
             <wp:docPr id="2" name="Picture 2"/>
             <wp:cNvGraphicFramePr>
               <a:graphicFrameLocks noChangeAspect="1"/>
@@ -361,7 +361,7 @@
                   <pic:spPr>
                     <a:xfrm>
                       <a:off x="0" y="0"/>
-                      <a:ext cx="5669280" cy="3246511"/>
+                      <a:ext cx="5669280" cy="3682609"/>
                     </a:xfrm>
                     <a:prstGeom prst="rect"/>
                   </pic:spPr>
@@ -430,7 +430,7 @@
       <w:r>
         <w:drawing>
           <wp:inline xmlns:a="http://schemas.openxmlformats.org/drawingml/2006/main" xmlns:pic="http://schemas.openxmlformats.org/drawingml/2006/picture">
-            <wp:extent cx="5669280" cy="1423377"/>
+            <wp:extent cx="5669280" cy="1926102"/>
             <wp:docPr id="4" name="Picture 4"/>
             <wp:cNvGraphicFramePr>
               <a:graphicFrameLocks noChangeAspect="1"/>
@@ -451,7 +451,7 @@
                   <pic:spPr>
                     <a:xfrm>
                       <a:off x="0" y="0"/>
-                      <a:ext cx="5669280" cy="1423377"/>
+                      <a:ext cx="5669280" cy="1926102"/>
                     </a:xfrm>
                     <a:prstGeom prst="rect"/>
                   </pic:spPr>
@@ -621,7 +621,7 @@
     </w:p>
     <w:p>
       <w:r>
-        <w:t>You are a web development assistant. Create a simple, responsive, single-page website using HTML, CSS, Bootstrap, and only client-side JavaScript. Organization or business area: Scholars Opportunity Fund, a student-run event-driven fund. Business process: research request intake and triage. Process users: analysts, pod leads, portfolio managers, faculty advisor. Current process problem: requests arrive by message with missing details, status is hard to see, and analysts duplicate work. Show the current or basic version of this process. Include a navigation bar with Home, About, and Contact; a hero section; an About the Process section; a Current Information section; a footer with contact or social links; and a responsive Bootstrap layout. Add comments in the code. Provide the complete code in one file named index_v1.html.</w:t>
+        <w:t>You are a web development assistant. Create a simple, responsive, single-page website using HTML, CSS, Bootstrap, and only client-side JavaScript. Organization or business area: Scholars Opportunity Fund, a student-run systematic hedge fund that finds catalysts through event-driven work. Business process: research request intake and triage. Process users: analysts, pod leads, portfolio managers, faculty advisor. Current process problem: requests arrive by message with missing details, status is hard to see, and analysts duplicate work. Show the current or basic version of this process. Include a navigation bar with Home, About, and Contact; a hero section; an About the Process section; a Current Information section; a footer with contact or social links; and a responsive Bootstrap layout. Add comments in the code. Provide the complete code in one file named index_v1.html.</w:t>
       </w:r>
     </w:p>
     <w:p>
@@ -634,7 +634,7 @@
     </w:p>
     <w:p>
       <w:r>
-        <w:t>Using my previous webpage as the starting point, improve the business process and webpage functionality. Implement these two process improvements: (1) a request intake form with required fields, format validation, and a success message; (2) a searchable, filterable request queue showing status. Keep the site responsive with Bootstrap, use client-side HTML, CSS, and JavaScript only, label the new features in the code, explain how each improves the process, and do not remove the core information from Draft 1. Provide the complete code in one file named index_v2.html.</w:t>
+        <w:t>Using my previous webpage as the starting point, improve the business process and webpage functionality. Implement these two process improvements: (1) a request intake form with required fields, catalyst-type options, format validation, and a success message; (2) a searchable, filterable request queue showing status. Keep the site responsive with Bootstrap, use client-side HTML, CSS, and JavaScript only, label the new features in the code, explain how each improves the process, and do not remove the core information from Draft 1. Provide the complete code in one file named index_v2.html.</w:t>
       </w:r>
     </w:p>
     <w:p>
@@ -647,7 +647,7 @@
     </w:p>
     <w:p>
       <w:r>
-        <w:t>Improve the previous page into a connected research workflow, keeping everything in one client-side HTML file named index_v3.html. Add: (1) a dashboard with open, completed, overdue, and average-days-to-complete metrics plus a chart by stage, so managers can rebalance work early; (2) a five-stage workflow (Submitted, Triaged, In Research, In Review, Complete) with progress bars and a details modal that advances each request, so ownership and status are clear; (3) a duplicate-ticker warning on the form, so analysts do not repeat research; (4) a priority recommendation tool that scores event type and time left, so prioritization is consistent. Keep all earlier features and make everything work without a server.</w:t>
+        <w:t>Improve the previous page into a connected research workflow, keeping everything in one client-side HTML file named index_v3.html. Add: (1) a dashboard with open, completed, overdue, and average-days-to-complete metrics plus a chart by stage, so managers can rebalance work early; (2) a five-stage workflow (Submitted, Triaged, In Research, In Review, Complete) with progress bars and a details modal that advances each request, so ownership and status are clear; (3) a duplicate-ticker warning on the form, so analysts do not repeat research; (4) a priority recommendation tool that scores catalyst type and time left, so prioritization is consistent. Keep all earlier features and make everything work without a server.</w:t>
       </w:r>
     </w:p>
     <w:p>
@@ -660,7 +660,7 @@
     </w:p>
     <w:p>
       <w:r>
-        <w:t>My web project represents the research request process at the Scholars Opportunity Fund, a student-run event-driven fund. An analyst who wants research on a merger, spin-off, or similar situation asks a pod lead for help, the request gets tracked, and someone writes a memo that portfolio managers use to decide how to allocate capital.</w:t>
+        <w:t>My web project represents the research request process at the Scholars Opportunity Fund, a student-run systematic hedge fund that finds most of its catalysts through event-driven work. An analyst who wants research on a catalyst or signal idea asks a pod lead for help, the request gets tracked, and the fund returns a memo, dataset, or backtest that portfolio managers use to decide which strategies to run.</w:t>
       </w:r>
     </w:p>
     <w:p>
@@ -675,7 +675,7 @@
     </w:p>
     <w:p>
       <w:r>
-        <w:t>In Draft 3 I added a dashboard, a five-stage workflow tracker, duplicate detection, and a priority recommendation. The dashboard turns the queue into measures such as open requests, overdue requests, and average days to complete, which gives managers a reason to move work early. The workflow stages make it clear who owns the request at each step. The duplicate warning connects information that used to sit in separate conversations, and the priority tool scores event type and time left so prioritization is more consistent. Together these improve process quality by cutting wasted work and speeding up decisions.</w:t>
+        <w:t>In Draft 3 I added a dashboard, a five-stage workflow tracker, duplicate detection, and a priority recommendation. The dashboard turns the queue into measures such as open requests, overdue requests, and average days to complete, which gives managers a reason to move work early. The workflow stages make it clear who owns the request at each step. The duplicate warning connects information that used to sit in separate conversations, and the priority tool scores catalyst type and time left so prioritization is more consistent. Together these improve process quality by cutting wasted work and speeding up decisions.</w:t>
       </w:r>
     </w:p>
     <w:p>
@@ -698,7 +698,7 @@
     </w:p>
     <w:p>
       <w:r>
-        <w:t>[PLACEHOLDER: learning outcome paragraph to be added]</w:t>
+        <w:t>This lab advanced my first customized learning outcome, to analyze and improve a technical investment system by automating repetitive steps, improving workflow efficiency, and keeping the analysis accurate and reliable. I mapped a real workflow from my work as an analyst at the Scholars Opportunity Fund, a systematic hedge fund, and found where information gets lost between a research idea and a usable result. Modeling the process by its inputs, activities, outputs, and customers, then redesigning it across three drafts, is the skill that connects most directly to the outcome. Adding validation, a shared queue, and a dashboard showed me how to remove manual follow-up without losing control of the data. The lab also touched my second outcome, because I had to test every AI-assisted feature and keep fund data out of the sample content. In my career in asset management, I expect to build and improve research and testing workflows like this one, and measuring turnaround time will show whether an improvement actually saves time.</w:t>
       </w:r>
     </w:p>
     <w:sectPr>

</xml_diff>